<commit_message>
Masters v15: deliberate two-line contact header (fix accidental wrap)
The GitHub link overflowed the single contact line (the phone number wrapped
alone). Restructured with an explicit <w:br/>: line 1 = email · phone,
line 2 = linkedin · github · Portfolio: site (label kept per request).

Co-Authored-By: Claude Fable 5 <noreply@anthropic.com>
</commit_message>
<xml_diff>
--- a/assets/Lenin_Cuadra_CV_EN_v15.docx
+++ b/assets/Lenin_Cuadra_CV_EN_v15.docx
@@ -84,7 +84,10 @@
           <w:sz-cs w:val="18"/>
           <w:color w:val="6B7280"/>
         </w:rPr>
-        <w:t xml:space="preserve">   ·  </w:t>
+        <w:t xml:space="preserve">  ·  +54 9 351-376-6049</w:t>
+      </w:r>
+      <w:r>
+        <w:br/>
       </w:r>
       <w:hyperlink r:id="rId101">
         <w:r>
@@ -148,15 +151,6 @@
           <w:color w:val="1A56DB"/>
         </w:rPr>
         <w:t xml:space="preserve"> </w:t>
-      </w:r>
-      <w:r>
-        <w:rPr>
-          <w:rFonts w:ascii="Arial" w:hAnsi="Arial" w:cs="Arial"/>
-          <w:sz w:val="18"/>
-          <w:sz-cs w:val="18"/>
-          <w:color w:val="6B7280"/>
-        </w:rPr>
-        <w:t xml:space="preserve">·  +54 9 351-376-6049</w:t>
       </w:r>
       <w:r>
         <w:rPr>

</xml_diff>

<commit_message>
Masters v15: single-line contact header with pipes (user's redesign)
Portfolio: lenincuadra.com | <email> | linkedin | github | phone — replaces
the two-line <w:br/> layout. "Portfolio:" label bold dark, pipes/phone muted,
links canonical blue. All three tracked hyperlinks rebuilt intact.

Co-Authored-By: Claude Fable 5 <noreply@anthropic.com>
</commit_message>
<xml_diff>
--- a/assets/Lenin_Cuadra_CV_EN_v15.docx
+++ b/assets/Lenin_Cuadra_CV_EN_v15.docx
@@ -69,6 +69,37 @@
       </w:pPr>
       <w:r>
         <w:rPr>
+          <w:b/>
+          <w:rFonts w:ascii="Arial" w:hAnsi="Arial" w:cs="Arial"/>
+          <w:sz w:val="18"/>
+          <w:sz-cs w:val="18"/>
+          <w:color w:val="111827"/>
+        </w:rPr>
+        <w:t xml:space="preserve">Portfolio: </w:t>
+      </w:r>
+      <w:hyperlink r:id="rId100">
+        <w:r>
+          <w:rPr>
+            <w:rFonts w:ascii="Arial" w:hAnsi="Arial" w:cs="Arial"/>
+            <w:sz w:val="18"/>
+            <w:sz-cs w:val="18"/>
+            <w:u w:val="single"/>
+            <w:color w:val="1A56DB"/>
+          </w:rPr>
+          <w:t xml:space="preserve">lenincuadra.com</w:t>
+        </w:r>
+      </w:hyperlink>
+      <w:r>
+        <w:rPr>
+          <w:rFonts w:ascii="Arial" w:hAnsi="Arial" w:cs="Arial"/>
+          <w:sz w:val="18"/>
+          <w:sz-cs w:val="18"/>
+          <w:color w:val="6B7280"/>
+        </w:rPr>
+        <w:t xml:space="preserve"> | </w:t>
+      </w:r>
+      <w:r>
+        <w:rPr>
           <w:rFonts w:ascii="Arial" w:hAnsi="Arial" w:cs="Arial"/>
           <w:sz w:val="18"/>
           <w:sz-cs w:val="18"/>
@@ -84,10 +115,7 @@
           <w:sz-cs w:val="18"/>
           <w:color w:val="6B7280"/>
         </w:rPr>
-        <w:t xml:space="preserve">  ·  +54 9 351-376-6049</w:t>
-      </w:r>
-      <w:r>
-        <w:br/>
+        <w:t xml:space="preserve"> | </w:t>
       </w:r>
       <w:hyperlink r:id="rId101">
         <w:r>
@@ -108,7 +136,7 @@
           <w:sz-cs w:val="18"/>
           <w:color w:val="6B7280"/>
         </w:rPr>
-        <w:t xml:space="preserve">  ·  </w:t>
+        <w:t xml:space="preserve"> | </w:t>
       </w:r>
       <w:hyperlink r:id="rId102">
         <w:r>
@@ -129,37 +157,16 @@
           <w:sz-cs w:val="18"/>
           <w:color w:val="6B7280"/>
         </w:rPr>
-        <w:t xml:space="preserve">  ·  Portfolio: </w:t>
-      </w:r>
-      <w:hyperlink r:id="rId100">
-        <w:r>
-          <w:rPr>
-            <w:rFonts w:ascii="Arial" w:hAnsi="Arial" w:cs="Arial"/>
-            <w:sz w:val="18"/>
-            <w:sz-cs w:val="18"/>
-            <w:u w:val="single"/>
-            <w:color w:val="1A56DB"/>
-          </w:rPr>
-          <w:t xml:space="preserve">lenincuadra.com</w:t>
-        </w:r>
-      </w:hyperlink>
-      <w:r>
-        <w:rPr>
-          <w:rFonts w:ascii="Arial" w:hAnsi="Arial" w:cs="Arial"/>
-          <w:sz w:val="18"/>
-          <w:sz-cs w:val="18"/>
-          <w:color w:val="1A56DB"/>
-        </w:rPr>
-        <w:t xml:space="preserve"> </w:t>
-      </w:r>
-      <w:r>
-        <w:rPr>
-          <w:rFonts w:ascii="Arial" w:hAnsi="Arial" w:cs="Arial"/>
-          <w:sz w:val="18"/>
-          <w:sz-cs w:val="18"/>
-          <w:color w:val="1A56DB"/>
-        </w:rPr>
-        <w:t xml:space="preserve"/>
+        <w:t xml:space="preserve"> | </w:t>
+      </w:r>
+      <w:r>
+        <w:rPr>
+          <w:rFonts w:ascii="Arial" w:hAnsi="Arial" w:cs="Arial"/>
+          <w:sz w:val="18"/>
+          <w:sz-cs w:val="18"/>
+          <w:color w:val="6B7280"/>
+        </w:rPr>
+        <w:t xml:space="preserve">+54 9 351-376-6049</w:t>
       </w:r>
     </w:p>
     <w:p>

</xml_diff>

<commit_message>
Masters v15: two-line labeled contact header from user's reference docx
Transplanted the contact block designed by the user in a reference CV:
line 1 "| Portfolio: | Github: | Linkedin:" and line 2 "| Contact: | phone",
bold labels, tabs between groups. Email is now a mailto: hyperlink (rId103);
its color normalized from the editor default 1155cc to canonical 1A56DB.
Baked ref code and focus param from the reference restored to ref=li-cv
placeholders. All three tracked links verified intact.

Co-Authored-By: Claude Fable 5 <noreply@anthropic.com>
</commit_message>
<xml_diff>
--- a/assets/Lenin_Cuadra_CV_EN_v15.docx
+++ b/assets/Lenin_Cuadra_CV_EN_v15.docx
@@ -65,108 +65,164 @@
     </w:p>
     <w:p>
       <w:pPr>
-        <w:spacing w:after="60"/>
-      </w:pPr>
-      <w:r>
-        <w:rPr>
-          <w:b/>
-          <w:rFonts w:ascii="Arial" w:hAnsi="Arial" w:cs="Arial"/>
-          <w:sz w:val="18"/>
-          <w:sz-cs w:val="18"/>
-          <w:color w:val="111827"/>
-        </w:rPr>
-        <w:t xml:space="preserve">Portfolio: </w:t>
+        <w:spacing w:after="60" w:lineRule="auto"/>
+        <w:rPr>
+          <w:rFonts w:ascii="Arial" w:cs="Arial" w:eastAsia="Arial" w:hAnsi="Arial"/>
+          <w:color w:val="1A56DB"/>
+          <w:sz w:val="18"/>
+          <w:szCs w:val="18"/>
+          <w:u w:val="single"/>
+        </w:rPr>
+      </w:pPr>
+      <w:r>
+        <w:rPr>
+          <w:rFonts w:ascii="Arial" w:cs="Arial" w:eastAsia="Arial" w:hAnsi="Arial"/>
+          <w:b w:val="1"/>
+          <w:bCs w:val="1"/>
+          <w:color w:val="111827"/>
+          <w:sz w:val="18"/>
+          <w:szCs w:val="18"/>
+          <w:rtl w:val="0"/>
+        </w:rPr>
+        <w:t xml:space="preserve">| Portfolio: </w:t>
       </w:r>
       <w:hyperlink r:id="rId100">
         <w:r>
           <w:rPr>
-            <w:rFonts w:ascii="Arial" w:hAnsi="Arial" w:cs="Arial"/>
+            <w:rFonts w:ascii="Arial" w:cs="Arial" w:eastAsia="Arial" w:hAnsi="Arial"/>
+            <w:color w:val="1A56DB"/>
             <w:sz w:val="18"/>
-            <w:sz-cs w:val="18"/>
+            <w:szCs w:val="18"/>
             <w:u w:val="single"/>
-            <w:color w:val="1A56DB"/>
+            <w:rtl w:val="0"/>
           </w:rPr>
           <w:t xml:space="preserve">lenincuadra.com</w:t>
         </w:r>
       </w:hyperlink>
       <w:r>
         <w:rPr>
-          <w:rFonts w:ascii="Arial" w:hAnsi="Arial" w:cs="Arial"/>
-          <w:sz w:val="18"/>
-          <w:sz-cs w:val="18"/>
-          <w:color w:val="6B7280"/>
-        </w:rPr>
-        <w:t xml:space="preserve"> | </w:t>
-      </w:r>
-      <w:r>
-        <w:rPr>
-          <w:rFonts w:ascii="Arial" w:hAnsi="Arial" w:cs="Arial"/>
-          <w:sz w:val="18"/>
-          <w:sz-cs w:val="18"/>
-          <w:u w:val="single"/>
-          <w:color w:val="1A56DB"/>
-        </w:rPr>
-        <w:t xml:space="preserve">hi@lenincuadra.com</w:t>
-      </w:r>
-      <w:r>
-        <w:rPr>
-          <w:rFonts w:ascii="Arial" w:hAnsi="Arial" w:cs="Arial"/>
-          <w:sz w:val="18"/>
-          <w:sz-cs w:val="18"/>
-          <w:color w:val="6B7280"/>
-        </w:rPr>
-        <w:t xml:space="preserve"> | </w:t>
+          <w:rFonts w:ascii="Arial" w:cs="Arial" w:eastAsia="Arial" w:hAnsi="Arial"/>
+          <w:b w:val="1"/>
+          <w:bCs w:val="1"/>
+          <w:color w:val="111827"/>
+          <w:sz w:val="18"/>
+          <w:szCs w:val="18"/>
+          <w:rtl w:val="0"/>
+        </w:rPr>
+        <w:tab/>
+        <w:t xml:space="preserve">| Github: </w:t>
+      </w:r>
+      <w:hyperlink r:id="rId102">
+        <w:r>
+          <w:rPr>
+            <w:rFonts w:ascii="Arial" w:cs="Arial" w:eastAsia="Arial" w:hAnsi="Arial"/>
+            <w:color w:val="1A56DB"/>
+            <w:sz w:val="18"/>
+            <w:szCs w:val="18"/>
+            <w:u w:val="single"/>
+            <w:rtl w:val="0"/>
+          </w:rPr>
+          <w:t xml:space="preserve">github.com/lenincuadra</w:t>
+        </w:r>
+      </w:hyperlink>
+      <w:r>
+        <w:rPr>
+          <w:rFonts w:ascii="Arial" w:cs="Arial" w:eastAsia="Arial" w:hAnsi="Arial"/>
+          <w:b w:val="1"/>
+          <w:bCs w:val="1"/>
+          <w:color w:val="111827"/>
+          <w:sz w:val="18"/>
+          <w:szCs w:val="18"/>
+          <w:rtl w:val="0"/>
+        </w:rPr>
+        <w:tab/>
+        <w:t xml:space="preserve">| Linkedin: </w:t>
       </w:r>
       <w:hyperlink r:id="rId101">
         <w:r>
           <w:rPr>
-            <w:rFonts w:ascii="Arial" w:hAnsi="Arial" w:cs="Arial"/>
+            <w:rFonts w:ascii="Arial" w:cs="Arial" w:eastAsia="Arial" w:hAnsi="Arial"/>
+            <w:color w:val="1A56DB"/>
             <w:sz w:val="18"/>
-            <w:sz-cs w:val="18"/>
+            <w:szCs w:val="18"/>
             <w:u w:val="single"/>
-            <w:color w:val="1A56DB"/>
+            <w:rtl w:val="0"/>
           </w:rPr>
           <w:t xml:space="preserve">linkedin.com/in/lenincuadra</w:t>
         </w:r>
       </w:hyperlink>
       <w:r>
         <w:rPr>
-          <w:rFonts w:ascii="Arial" w:hAnsi="Arial" w:cs="Arial"/>
-          <w:sz w:val="18"/>
-          <w:sz-cs w:val="18"/>
-          <w:color w:val="6B7280"/>
-        </w:rPr>
-        <w:t xml:space="preserve"> | </w:t>
-      </w:r>
-      <w:hyperlink r:id="rId102">
+          <w:rtl w:val="0"/>
+        </w:rPr>
+      </w:r>
+    </w:p>
+    <w:p>
+      <w:pPr>
+        <w:spacing w:after="60" w:lineRule="auto"/>
+        <w:rPr/>
+      </w:pPr>
+      <w:r>
+        <w:rPr>
+          <w:rFonts w:ascii="Arial" w:cs="Arial" w:eastAsia="Arial" w:hAnsi="Arial"/>
+          <w:b w:val="1"/>
+          <w:bCs w:val="1"/>
+          <w:color w:val="111827"/>
+          <w:sz w:val="18"/>
+          <w:szCs w:val="18"/>
+          <w:rtl w:val="0"/>
+        </w:rPr>
+        <w:t xml:space="preserve">| Contact: </w:t>
+      </w:r>
+      <w:hyperlink r:id="rId103">
         <w:r>
           <w:rPr>
-            <w:rFonts w:ascii="Arial" w:hAnsi="Arial" w:cs="Arial"/>
+            <w:rFonts w:ascii="Arial" w:cs="Arial" w:eastAsia="Arial" w:hAnsi="Arial"/>
+            <w:color w:val="1A56DB"/>
             <w:sz w:val="18"/>
-            <w:sz-cs w:val="18"/>
+            <w:szCs w:val="18"/>
             <w:u w:val="single"/>
-            <w:color w:val="1A56DB"/>
+            <w:rtl w:val="0"/>
           </w:rPr>
-          <w:t xml:space="preserve">github.com/lenincuadra</w:t>
+          <w:t xml:space="preserve">hi@lenincuadra.com</w:t>
         </w:r>
       </w:hyperlink>
       <w:r>
         <w:rPr>
-          <w:rFonts w:ascii="Arial" w:hAnsi="Arial" w:cs="Arial"/>
-          <w:sz w:val="18"/>
-          <w:sz-cs w:val="18"/>
-          <w:color w:val="6B7280"/>
-        </w:rPr>
-        <w:t xml:space="preserve"> | </w:t>
-      </w:r>
-      <w:r>
-        <w:rPr>
-          <w:rFonts w:ascii="Arial" w:hAnsi="Arial" w:cs="Arial"/>
-          <w:sz w:val="18"/>
-          <w:sz-cs w:val="18"/>
-          <w:color w:val="6B7280"/>
-        </w:rPr>
-        <w:t xml:space="preserve">+54 9 351-376-6049</w:t>
+          <w:rFonts w:ascii="Arial" w:cs="Arial" w:eastAsia="Arial" w:hAnsi="Arial"/>
+          <w:color w:val="6B7280"/>
+          <w:sz w:val="18"/>
+          <w:szCs w:val="18"/>
+          <w:rtl w:val="0"/>
+        </w:rPr>
+        <w:tab/>
+      </w:r>
+      <w:r>
+        <w:rPr>
+          <w:rFonts w:ascii="Arial" w:cs="Arial" w:eastAsia="Arial" w:hAnsi="Arial"/>
+          <w:b w:val="1"/>
+          <w:bCs w:val="1"/>
+          <w:color w:val="111827"/>
+          <w:sz w:val="18"/>
+          <w:szCs w:val="18"/>
+          <w:rtl w:val="0"/>
+        </w:rPr>
+        <w:t xml:space="preserve">| </w:t>
+      </w:r>
+      <w:r>
+        <w:rPr>
+          <w:rFonts w:ascii="Arial" w:cs="Arial" w:eastAsia="Arial" w:hAnsi="Arial"/>
+          <w:color w:val="6B7280"/>
+          <w:sz w:val="18"/>
+          <w:szCs w:val="18"/>
+          <w:rtl w:val="0"/>
+        </w:rPr>
+        <w:t xml:space="preserve">+549 351-376-6049</w:t>
+      </w:r>
+      <w:r>
+        <w:rPr>
+          <w:rtl w:val="0"/>
+        </w:rPr>
       </w:r>
     </w:p>
     <w:p>

</xml_diff>